<commit_message>
Add local Ragas evaluation and Q3 results
</commit_message>
<xml_diff>
--- a/shared_output/Q3_Guardrails_Eval_Agents/Q3_Guardrails_Eval_Agents.docx
+++ b/shared_output/Q3_Guardrails_Eval_Agents/Q3_Guardrails_Eval_Agents.docx
@@ -1068,6 +1068,1101 @@
     </w:p>
     <w:p>
       <w:pPr>
+        <w:pStyle w:val="Heading2"/>
+      </w:pPr>
+      <w:r>
+        <w:t>Ragas evidence-quality evaluation</w:t>
+      </w:r>
+    </w:p>
+    <w:p>
+      <w:r>
+        <w:t>Why Ragas. Fluent answers can still use irrelevant evidence, omit reference facts, or introduce unsupported claims. Ragas complements deterministic Recall@k, MRR, citation, abstention, and safety checks by evaluating retrieval and generation separately. The six metrics remain separate diagnostics; they are not averaged into one score.</w:t>
+      </w:r>
+    </w:p>
+    <w:p>
+      <w:pPr>
+        <w:pStyle w:val="Heading3"/>
+      </w:pPr>
+      <w:r>
+        <w:t>Metrics used</w:t>
+      </w:r>
+    </w:p>
+    <w:tbl>
+      <w:tblPr>
+        <w:tblStyle w:val="TableGrid"/>
+        <w:tblW w:type="dxa" w:w="9360"/>
+        <w:tblLayout w:type="fixed"/>
+        <w:tblLook w:firstColumn="1" w:firstRow="1" w:lastColumn="0" w:lastRow="0" w:noHBand="0" w:noVBand="1" w:val="04A0"/>
+      </w:tblPr>
+      <w:tblGrid>
+        <w:gridCol w:w="1700"/>
+        <w:gridCol w:w="2550"/>
+        <w:gridCol w:w="5110"/>
+      </w:tblGrid>
+      <w:tr>
+        <w:tc>
+          <w:tcPr>
+            <w:tcW w:type="dxa" w:w="1700"/>
+            <w:shd w:fill="1F4E78"/>
+            <w:vAlign w:val="center"/>
+          </w:tcPr>
+          <w:p>
+            <w:pPr>
+              <w:spacing w:before="0" w:after="0" w:line="240" w:lineRule="auto"/>
+            </w:pPr>
+            <w:r>
+              <w:rPr>
+                <w:b/>
+                <w:color w:val="FFFFFF"/>
+                <w:sz w:val="15"/>
+              </w:rPr>
+              <w:t>Metric</w:t>
+            </w:r>
+          </w:p>
+        </w:tc>
+        <w:tc>
+          <w:tcPr>
+            <w:tcW w:type="dxa" w:w="2550"/>
+            <w:shd w:fill="1F4E78"/>
+            <w:vAlign w:val="center"/>
+          </w:tcPr>
+          <w:p>
+            <w:pPr>
+              <w:spacing w:before="0" w:after="0" w:line="240" w:lineRule="auto"/>
+            </w:pPr>
+            <w:r>
+              <w:rPr>
+                <w:b/>
+                <w:color w:val="FFFFFF"/>
+                <w:sz w:val="15"/>
+              </w:rPr>
+              <w:t>Primary inputs</w:t>
+            </w:r>
+          </w:p>
+        </w:tc>
+        <w:tc>
+          <w:tcPr>
+            <w:tcW w:type="dxa" w:w="5110"/>
+            <w:shd w:fill="1F4E78"/>
+            <w:vAlign w:val="center"/>
+          </w:tcPr>
+          <w:p>
+            <w:pPr>
+              <w:spacing w:before="0" w:after="0" w:line="240" w:lineRule="auto"/>
+            </w:pPr>
+            <w:r>
+              <w:rPr>
+                <w:b/>
+                <w:color w:val="FFFFFF"/>
+                <w:sz w:val="15"/>
+              </w:rPr>
+              <w:t>Question answered</w:t>
+            </w:r>
+          </w:p>
+        </w:tc>
+      </w:tr>
+      <w:tr>
+        <w:tc>
+          <w:tcPr>
+            <w:tcW w:type="dxa" w:w="1700"/>
+            <w:vAlign w:val="center"/>
+          </w:tcPr>
+          <w:p>
+            <w:pPr>
+              <w:spacing w:before="0" w:after="0" w:line="240" w:lineRule="auto"/>
+            </w:pPr>
+            <w:r>
+              <w:rPr>
+                <w:sz w:val="15"/>
+              </w:rPr>
+              <w:t>Faithfulness</w:t>
+            </w:r>
+          </w:p>
+        </w:tc>
+        <w:tc>
+          <w:tcPr>
+            <w:tcW w:type="dxa" w:w="2550"/>
+            <w:vAlign w:val="center"/>
+          </w:tcPr>
+          <w:p>
+            <w:pPr>
+              <w:spacing w:before="0" w:after="0" w:line="240" w:lineRule="auto"/>
+            </w:pPr>
+            <w:r>
+              <w:rPr>
+                <w:sz w:val="15"/>
+              </w:rPr>
+              <w:t>Answer + generation contexts</w:t>
+            </w:r>
+          </w:p>
+        </w:tc>
+        <w:tc>
+          <w:tcPr>
+            <w:tcW w:type="dxa" w:w="5110"/>
+            <w:vAlign w:val="center"/>
+          </w:tcPr>
+          <w:p>
+            <w:pPr>
+              <w:spacing w:before="0" w:after="0" w:line="240" w:lineRule="auto"/>
+            </w:pPr>
+            <w:r>
+              <w:rPr>
+                <w:sz w:val="15"/>
+              </w:rPr>
+              <w:t>Are factual claims supported by supplied evidence?</w:t>
+            </w:r>
+          </w:p>
+        </w:tc>
+      </w:tr>
+      <w:tr>
+        <w:tc>
+          <w:tcPr>
+            <w:tcW w:type="dxa" w:w="1700"/>
+            <w:vAlign w:val="center"/>
+          </w:tcPr>
+          <w:p>
+            <w:pPr>
+              <w:spacing w:before="0" w:after="0" w:line="240" w:lineRule="auto"/>
+            </w:pPr>
+            <w:r>
+              <w:rPr>
+                <w:sz w:val="15"/>
+              </w:rPr>
+              <w:t>Answer relevancy</w:t>
+            </w:r>
+          </w:p>
+        </w:tc>
+        <w:tc>
+          <w:tcPr>
+            <w:tcW w:type="dxa" w:w="2550"/>
+            <w:vAlign w:val="center"/>
+          </w:tcPr>
+          <w:p>
+            <w:pPr>
+              <w:spacing w:before="0" w:after="0" w:line="240" w:lineRule="auto"/>
+            </w:pPr>
+            <w:r>
+              <w:rPr>
+                <w:sz w:val="15"/>
+              </w:rPr>
+              <w:t>Question + answer</w:t>
+            </w:r>
+          </w:p>
+        </w:tc>
+        <w:tc>
+          <w:tcPr>
+            <w:tcW w:type="dxa" w:w="5110"/>
+            <w:vAlign w:val="center"/>
+          </w:tcPr>
+          <w:p>
+            <w:pPr>
+              <w:spacing w:before="0" w:after="0" w:line="240" w:lineRule="auto"/>
+            </w:pPr>
+            <w:r>
+              <w:rPr>
+                <w:sz w:val="15"/>
+              </w:rPr>
+              <w:t>Does the response directly address the question?</w:t>
+            </w:r>
+          </w:p>
+        </w:tc>
+      </w:tr>
+      <w:tr>
+        <w:tc>
+          <w:tcPr>
+            <w:tcW w:type="dxa" w:w="1700"/>
+            <w:vAlign w:val="center"/>
+          </w:tcPr>
+          <w:p>
+            <w:pPr>
+              <w:spacing w:before="0" w:after="0" w:line="240" w:lineRule="auto"/>
+            </w:pPr>
+            <w:r>
+              <w:rPr>
+                <w:sz w:val="15"/>
+              </w:rPr>
+              <w:t>Context precision</w:t>
+            </w:r>
+          </w:p>
+        </w:tc>
+        <w:tc>
+          <w:tcPr>
+            <w:tcW w:type="dxa" w:w="2550"/>
+            <w:vAlign w:val="center"/>
+          </w:tcPr>
+          <w:p>
+            <w:pPr>
+              <w:spacing w:before="0" w:after="0" w:line="240" w:lineRule="auto"/>
+            </w:pPr>
+            <w:r>
+              <w:rPr>
+                <w:sz w:val="15"/>
+              </w:rPr>
+              <w:t>Question + ranked contexts + reference</w:t>
+            </w:r>
+          </w:p>
+        </w:tc>
+        <w:tc>
+          <w:tcPr>
+            <w:tcW w:type="dxa" w:w="5110"/>
+            <w:vAlign w:val="center"/>
+          </w:tcPr>
+          <w:p>
+            <w:pPr>
+              <w:spacing w:before="0" w:after="0" w:line="240" w:lineRule="auto"/>
+            </w:pPr>
+            <w:r>
+              <w:rPr>
+                <w:sz w:val="15"/>
+              </w:rPr>
+              <w:t>Is relevant evidence ranked early with limited noise?</w:t>
+            </w:r>
+          </w:p>
+        </w:tc>
+      </w:tr>
+      <w:tr>
+        <w:tc>
+          <w:tcPr>
+            <w:tcW w:type="dxa" w:w="1700"/>
+            <w:vAlign w:val="center"/>
+          </w:tcPr>
+          <w:p>
+            <w:pPr>
+              <w:spacing w:before="0" w:after="0" w:line="240" w:lineRule="auto"/>
+            </w:pPr>
+            <w:r>
+              <w:rPr>
+                <w:sz w:val="15"/>
+              </w:rPr>
+              <w:t>Context recall</w:t>
+            </w:r>
+          </w:p>
+        </w:tc>
+        <w:tc>
+          <w:tcPr>
+            <w:tcW w:type="dxa" w:w="2550"/>
+            <w:vAlign w:val="center"/>
+          </w:tcPr>
+          <w:p>
+            <w:pPr>
+              <w:spacing w:before="0" w:after="0" w:line="240" w:lineRule="auto"/>
+            </w:pPr>
+            <w:r>
+              <w:rPr>
+                <w:sz w:val="15"/>
+              </w:rPr>
+              <w:t>Contexts + reference</w:t>
+            </w:r>
+          </w:p>
+        </w:tc>
+        <w:tc>
+          <w:tcPr>
+            <w:tcW w:type="dxa" w:w="5110"/>
+            <w:vAlign w:val="center"/>
+          </w:tcPr>
+          <w:p>
+            <w:pPr>
+              <w:spacing w:before="0" w:after="0" w:line="240" w:lineRule="auto"/>
+            </w:pPr>
+            <w:r>
+              <w:rPr>
+                <w:sz w:val="15"/>
+              </w:rPr>
+              <w:t>Do retrieved passages cover the reference facts?</w:t>
+            </w:r>
+          </w:p>
+        </w:tc>
+      </w:tr>
+      <w:tr>
+        <w:tc>
+          <w:tcPr>
+            <w:tcW w:type="dxa" w:w="1700"/>
+            <w:vAlign w:val="center"/>
+          </w:tcPr>
+          <w:p>
+            <w:pPr>
+              <w:spacing w:before="0" w:after="0" w:line="240" w:lineRule="auto"/>
+            </w:pPr>
+            <w:r>
+              <w:rPr>
+                <w:sz w:val="15"/>
+              </w:rPr>
+              <w:t>Answer correctness</w:t>
+            </w:r>
+          </w:p>
+        </w:tc>
+        <w:tc>
+          <w:tcPr>
+            <w:tcW w:type="dxa" w:w="2550"/>
+            <w:vAlign w:val="center"/>
+          </w:tcPr>
+          <w:p>
+            <w:pPr>
+              <w:spacing w:before="0" w:after="0" w:line="240" w:lineRule="auto"/>
+            </w:pPr>
+            <w:r>
+              <w:rPr>
+                <w:sz w:val="15"/>
+              </w:rPr>
+              <w:t>Answer + reference</w:t>
+            </w:r>
+          </w:p>
+        </w:tc>
+        <w:tc>
+          <w:tcPr>
+            <w:tcW w:type="dxa" w:w="5110"/>
+            <w:vAlign w:val="center"/>
+          </w:tcPr>
+          <w:p>
+            <w:pPr>
+              <w:spacing w:before="0" w:after="0" w:line="240" w:lineRule="auto"/>
+            </w:pPr>
+            <w:r>
+              <w:rPr>
+                <w:sz w:val="15"/>
+              </w:rPr>
+              <w:t>Does the response agree factually and semantically with the reference?</w:t>
+            </w:r>
+          </w:p>
+        </w:tc>
+      </w:tr>
+      <w:tr>
+        <w:tc>
+          <w:tcPr>
+            <w:tcW w:type="dxa" w:w="1700"/>
+            <w:vAlign w:val="center"/>
+          </w:tcPr>
+          <w:p>
+            <w:pPr>
+              <w:spacing w:before="0" w:after="0" w:line="240" w:lineRule="auto"/>
+            </w:pPr>
+            <w:r>
+              <w:rPr>
+                <w:sz w:val="15"/>
+              </w:rPr>
+              <w:t>Answer similarity</w:t>
+            </w:r>
+          </w:p>
+        </w:tc>
+        <w:tc>
+          <w:tcPr>
+            <w:tcW w:type="dxa" w:w="2550"/>
+            <w:vAlign w:val="center"/>
+          </w:tcPr>
+          <w:p>
+            <w:pPr>
+              <w:spacing w:before="0" w:after="0" w:line="240" w:lineRule="auto"/>
+            </w:pPr>
+            <w:r>
+              <w:rPr>
+                <w:sz w:val="15"/>
+              </w:rPr>
+              <w:t>Answer + reference embeddings</w:t>
+            </w:r>
+          </w:p>
+        </w:tc>
+        <w:tc>
+          <w:tcPr>
+            <w:tcW w:type="dxa" w:w="5110"/>
+            <w:vAlign w:val="center"/>
+          </w:tcPr>
+          <w:p>
+            <w:pPr>
+              <w:spacing w:before="0" w:after="0" w:line="240" w:lineRule="auto"/>
+            </w:pPr>
+            <w:r>
+              <w:rPr>
+                <w:sz w:val="15"/>
+              </w:rPr>
+              <w:t>How close is the answer's meaning to the reference?</w:t>
+            </w:r>
+          </w:p>
+        </w:tc>
+      </w:tr>
+    </w:tbl>
+    <w:p>
+      <w:pPr>
+        <w:pStyle w:val="Heading3"/>
+      </w:pPr>
+      <w:r>
+        <w:t>Three-question results</w:t>
+      </w:r>
+    </w:p>
+    <w:tbl>
+      <w:tblPr>
+        <w:tblStyle w:val="TableGrid"/>
+        <w:tblW w:type="dxa" w:w="9360"/>
+        <w:tblLayout w:type="fixed"/>
+        <w:tblLook w:firstColumn="1" w:firstRow="1" w:lastColumn="0" w:lastRow="0" w:noHBand="0" w:noVBand="1" w:val="04A0"/>
+      </w:tblPr>
+      <w:tblGrid>
+        <w:gridCol w:w="3000"/>
+        <w:gridCol w:w="1500"/>
+        <w:gridCol w:w="1500"/>
+        <w:gridCol w:w="1500"/>
+        <w:gridCol w:w="1860"/>
+      </w:tblGrid>
+      <w:tr>
+        <w:tc>
+          <w:tcPr>
+            <w:tcW w:type="dxa" w:w="3000"/>
+            <w:shd w:fill="1F4E78"/>
+            <w:vAlign w:val="center"/>
+          </w:tcPr>
+          <w:p>
+            <w:pPr>
+              <w:spacing w:before="0" w:after="0" w:line="240" w:lineRule="auto"/>
+            </w:pPr>
+            <w:r>
+              <w:rPr>
+                <w:b/>
+                <w:color w:val="FFFFFF"/>
+                <w:sz w:val="15"/>
+              </w:rPr>
+              <w:t>Metric</w:t>
+            </w:r>
+          </w:p>
+        </w:tc>
+        <w:tc>
+          <w:tcPr>
+            <w:tcW w:type="dxa" w:w="1500"/>
+            <w:shd w:fill="1F4E78"/>
+            <w:vAlign w:val="center"/>
+          </w:tcPr>
+          <w:p>
+            <w:pPr>
+              <w:spacing w:before="0" w:after="0" w:line="240" w:lineRule="auto"/>
+            </w:pPr>
+            <w:r>
+              <w:rPr>
+                <w:b/>
+                <w:color w:val="FFFFFF"/>
+                <w:sz w:val="15"/>
+              </w:rPr>
+              <w:t>Q220</w:t>
+            </w:r>
+          </w:p>
+        </w:tc>
+        <w:tc>
+          <w:tcPr>
+            <w:tcW w:type="dxa" w:w="1500"/>
+            <w:shd w:fill="1F4E78"/>
+            <w:vAlign w:val="center"/>
+          </w:tcPr>
+          <w:p>
+            <w:pPr>
+              <w:spacing w:before="0" w:after="0" w:line="240" w:lineRule="auto"/>
+            </w:pPr>
+            <w:r>
+              <w:rPr>
+                <w:b/>
+                <w:color w:val="FFFFFF"/>
+                <w:sz w:val="15"/>
+              </w:rPr>
+              <w:t>Q1016</w:t>
+            </w:r>
+          </w:p>
+        </w:tc>
+        <w:tc>
+          <w:tcPr>
+            <w:tcW w:type="dxa" w:w="1500"/>
+            <w:shd w:fill="1F4E78"/>
+            <w:vAlign w:val="center"/>
+          </w:tcPr>
+          <w:p>
+            <w:pPr>
+              <w:spacing w:before="0" w:after="0" w:line="240" w:lineRule="auto"/>
+            </w:pPr>
+            <w:r>
+              <w:rPr>
+                <w:b/>
+                <w:color w:val="FFFFFF"/>
+                <w:sz w:val="15"/>
+              </w:rPr>
+              <w:t>Q1226</w:t>
+            </w:r>
+          </w:p>
+        </w:tc>
+        <w:tc>
+          <w:tcPr>
+            <w:tcW w:type="dxa" w:w="1860"/>
+            <w:shd w:fill="1F4E78"/>
+            <w:vAlign w:val="center"/>
+          </w:tcPr>
+          <w:p>
+            <w:pPr>
+              <w:spacing w:before="0" w:after="0" w:line="240" w:lineRule="auto"/>
+            </w:pPr>
+            <w:r>
+              <w:rPr>
+                <w:b/>
+                <w:color w:val="FFFFFF"/>
+                <w:sz w:val="15"/>
+              </w:rPr>
+              <w:t>Mean</w:t>
+            </w:r>
+          </w:p>
+        </w:tc>
+      </w:tr>
+      <w:tr>
+        <w:tc>
+          <w:tcPr>
+            <w:tcW w:type="dxa" w:w="3000"/>
+            <w:vAlign w:val="center"/>
+          </w:tcPr>
+          <w:p>
+            <w:pPr>
+              <w:spacing w:before="0" w:after="0" w:line="240" w:lineRule="auto"/>
+            </w:pPr>
+            <w:r>
+              <w:rPr>
+                <w:sz w:val="15"/>
+              </w:rPr>
+              <w:t>Faithfulness</w:t>
+            </w:r>
+          </w:p>
+        </w:tc>
+        <w:tc>
+          <w:tcPr>
+            <w:tcW w:type="dxa" w:w="1500"/>
+            <w:vAlign w:val="center"/>
+          </w:tcPr>
+          <w:p>
+            <w:pPr>
+              <w:spacing w:before="0" w:after="0" w:line="240" w:lineRule="auto"/>
+              <w:jc w:val="center"/>
+            </w:pPr>
+            <w:r>
+              <w:rPr>
+                <w:sz w:val="15"/>
+              </w:rPr>
+              <w:t>0.5000</w:t>
+            </w:r>
+          </w:p>
+        </w:tc>
+        <w:tc>
+          <w:tcPr>
+            <w:tcW w:type="dxa" w:w="1500"/>
+            <w:vAlign w:val="center"/>
+          </w:tcPr>
+          <w:p>
+            <w:pPr>
+              <w:spacing w:before="0" w:after="0" w:line="240" w:lineRule="auto"/>
+              <w:jc w:val="center"/>
+            </w:pPr>
+            <w:r>
+              <w:rPr>
+                <w:sz w:val="15"/>
+              </w:rPr>
+              <w:t>1.0000</w:t>
+            </w:r>
+          </w:p>
+        </w:tc>
+        <w:tc>
+          <w:tcPr>
+            <w:tcW w:type="dxa" w:w="1500"/>
+            <w:vAlign w:val="center"/>
+          </w:tcPr>
+          <w:p>
+            <w:pPr>
+              <w:spacing w:before="0" w:after="0" w:line="240" w:lineRule="auto"/>
+              <w:jc w:val="center"/>
+            </w:pPr>
+            <w:r>
+              <w:rPr>
+                <w:sz w:val="15"/>
+              </w:rPr>
+              <w:t>1.0000</w:t>
+            </w:r>
+          </w:p>
+        </w:tc>
+        <w:tc>
+          <w:tcPr>
+            <w:tcW w:type="dxa" w:w="1860"/>
+            <w:vAlign w:val="center"/>
+          </w:tcPr>
+          <w:p>
+            <w:pPr>
+              <w:spacing w:before="0" w:after="0" w:line="240" w:lineRule="auto"/>
+              <w:jc w:val="center"/>
+            </w:pPr>
+            <w:r>
+              <w:rPr>
+                <w:sz w:val="15"/>
+              </w:rPr>
+              <w:t>0.8333</w:t>
+            </w:r>
+          </w:p>
+        </w:tc>
+      </w:tr>
+      <w:tr>
+        <w:tc>
+          <w:tcPr>
+            <w:tcW w:type="dxa" w:w="3000"/>
+            <w:vAlign w:val="center"/>
+          </w:tcPr>
+          <w:p>
+            <w:pPr>
+              <w:spacing w:before="0" w:after="0" w:line="240" w:lineRule="auto"/>
+            </w:pPr>
+            <w:r>
+              <w:rPr>
+                <w:sz w:val="15"/>
+              </w:rPr>
+              <w:t>Answer relevancy</w:t>
+            </w:r>
+          </w:p>
+        </w:tc>
+        <w:tc>
+          <w:tcPr>
+            <w:tcW w:type="dxa" w:w="1500"/>
+            <w:vAlign w:val="center"/>
+          </w:tcPr>
+          <w:p>
+            <w:pPr>
+              <w:spacing w:before="0" w:after="0" w:line="240" w:lineRule="auto"/>
+              <w:jc w:val="center"/>
+            </w:pPr>
+            <w:r>
+              <w:rPr>
+                <w:sz w:val="15"/>
+              </w:rPr>
+              <w:t>0.8132</w:t>
+            </w:r>
+          </w:p>
+        </w:tc>
+        <w:tc>
+          <w:tcPr>
+            <w:tcW w:type="dxa" w:w="1500"/>
+            <w:vAlign w:val="center"/>
+          </w:tcPr>
+          <w:p>
+            <w:pPr>
+              <w:spacing w:before="0" w:after="0" w:line="240" w:lineRule="auto"/>
+              <w:jc w:val="center"/>
+            </w:pPr>
+            <w:r>
+              <w:rPr>
+                <w:sz w:val="15"/>
+              </w:rPr>
+              <w:t>1.0000</w:t>
+            </w:r>
+          </w:p>
+        </w:tc>
+        <w:tc>
+          <w:tcPr>
+            <w:tcW w:type="dxa" w:w="1500"/>
+            <w:vAlign w:val="center"/>
+          </w:tcPr>
+          <w:p>
+            <w:pPr>
+              <w:spacing w:before="0" w:after="0" w:line="240" w:lineRule="auto"/>
+              <w:jc w:val="center"/>
+            </w:pPr>
+            <w:r>
+              <w:rPr>
+                <w:sz w:val="15"/>
+              </w:rPr>
+              <w:t>0.7861</w:t>
+            </w:r>
+          </w:p>
+        </w:tc>
+        <w:tc>
+          <w:tcPr>
+            <w:tcW w:type="dxa" w:w="1860"/>
+            <w:vAlign w:val="center"/>
+          </w:tcPr>
+          <w:p>
+            <w:pPr>
+              <w:spacing w:before="0" w:after="0" w:line="240" w:lineRule="auto"/>
+              <w:jc w:val="center"/>
+            </w:pPr>
+            <w:r>
+              <w:rPr>
+                <w:sz w:val="15"/>
+              </w:rPr>
+              <w:t>0.8665</w:t>
+            </w:r>
+          </w:p>
+        </w:tc>
+      </w:tr>
+      <w:tr>
+        <w:tc>
+          <w:tcPr>
+            <w:tcW w:type="dxa" w:w="3000"/>
+            <w:vAlign w:val="center"/>
+          </w:tcPr>
+          <w:p>
+            <w:pPr>
+              <w:spacing w:before="0" w:after="0" w:line="240" w:lineRule="auto"/>
+            </w:pPr>
+            <w:r>
+              <w:rPr>
+                <w:sz w:val="15"/>
+              </w:rPr>
+              <w:t>Context precision</w:t>
+            </w:r>
+          </w:p>
+        </w:tc>
+        <w:tc>
+          <w:tcPr>
+            <w:tcW w:type="dxa" w:w="1500"/>
+            <w:vAlign w:val="center"/>
+          </w:tcPr>
+          <w:p>
+            <w:pPr>
+              <w:spacing w:before="0" w:after="0" w:line="240" w:lineRule="auto"/>
+              <w:jc w:val="center"/>
+            </w:pPr>
+            <w:r>
+              <w:rPr>
+                <w:sz w:val="15"/>
+              </w:rPr>
+              <w:t>1.0000</w:t>
+            </w:r>
+          </w:p>
+        </w:tc>
+        <w:tc>
+          <w:tcPr>
+            <w:tcW w:type="dxa" w:w="1500"/>
+            <w:vAlign w:val="center"/>
+          </w:tcPr>
+          <w:p>
+            <w:pPr>
+              <w:spacing w:before="0" w:after="0" w:line="240" w:lineRule="auto"/>
+              <w:jc w:val="center"/>
+            </w:pPr>
+            <w:r>
+              <w:rPr>
+                <w:sz w:val="15"/>
+              </w:rPr>
+              <w:t>1.0000</w:t>
+            </w:r>
+          </w:p>
+        </w:tc>
+        <w:tc>
+          <w:tcPr>
+            <w:tcW w:type="dxa" w:w="1500"/>
+            <w:vAlign w:val="center"/>
+          </w:tcPr>
+          <w:p>
+            <w:pPr>
+              <w:spacing w:before="0" w:after="0" w:line="240" w:lineRule="auto"/>
+              <w:jc w:val="center"/>
+            </w:pPr>
+            <w:r>
+              <w:rPr>
+                <w:sz w:val="15"/>
+              </w:rPr>
+              <w:t>1.0000</w:t>
+            </w:r>
+          </w:p>
+        </w:tc>
+        <w:tc>
+          <w:tcPr>
+            <w:tcW w:type="dxa" w:w="1860"/>
+            <w:vAlign w:val="center"/>
+          </w:tcPr>
+          <w:p>
+            <w:pPr>
+              <w:spacing w:before="0" w:after="0" w:line="240" w:lineRule="auto"/>
+              <w:jc w:val="center"/>
+            </w:pPr>
+            <w:r>
+              <w:rPr>
+                <w:sz w:val="15"/>
+              </w:rPr>
+              <w:t>1.0000</w:t>
+            </w:r>
+          </w:p>
+        </w:tc>
+      </w:tr>
+      <w:tr>
+        <w:tc>
+          <w:tcPr>
+            <w:tcW w:type="dxa" w:w="3000"/>
+            <w:vAlign w:val="center"/>
+          </w:tcPr>
+          <w:p>
+            <w:pPr>
+              <w:spacing w:before="0" w:after="0" w:line="240" w:lineRule="auto"/>
+            </w:pPr>
+            <w:r>
+              <w:rPr>
+                <w:sz w:val="15"/>
+              </w:rPr>
+              <w:t>Context recall</w:t>
+            </w:r>
+          </w:p>
+        </w:tc>
+        <w:tc>
+          <w:tcPr>
+            <w:tcW w:type="dxa" w:w="1500"/>
+            <w:vAlign w:val="center"/>
+          </w:tcPr>
+          <w:p>
+            <w:pPr>
+              <w:spacing w:before="0" w:after="0" w:line="240" w:lineRule="auto"/>
+              <w:jc w:val="center"/>
+            </w:pPr>
+            <w:r>
+              <w:rPr>
+                <w:sz w:val="15"/>
+              </w:rPr>
+              <w:t>1.0000</w:t>
+            </w:r>
+          </w:p>
+        </w:tc>
+        <w:tc>
+          <w:tcPr>
+            <w:tcW w:type="dxa" w:w="1500"/>
+            <w:vAlign w:val="center"/>
+          </w:tcPr>
+          <w:p>
+            <w:pPr>
+              <w:spacing w:before="0" w:after="0" w:line="240" w:lineRule="auto"/>
+              <w:jc w:val="center"/>
+            </w:pPr>
+            <w:r>
+              <w:rPr>
+                <w:sz w:val="15"/>
+              </w:rPr>
+              <w:t>1.0000</w:t>
+            </w:r>
+          </w:p>
+        </w:tc>
+        <w:tc>
+          <w:tcPr>
+            <w:tcW w:type="dxa" w:w="1500"/>
+            <w:vAlign w:val="center"/>
+          </w:tcPr>
+          <w:p>
+            <w:pPr>
+              <w:spacing w:before="0" w:after="0" w:line="240" w:lineRule="auto"/>
+              <w:jc w:val="center"/>
+            </w:pPr>
+            <w:r>
+              <w:rPr>
+                <w:sz w:val="15"/>
+              </w:rPr>
+              <w:t>1.0000</w:t>
+            </w:r>
+          </w:p>
+        </w:tc>
+        <w:tc>
+          <w:tcPr>
+            <w:tcW w:type="dxa" w:w="1860"/>
+            <w:vAlign w:val="center"/>
+          </w:tcPr>
+          <w:p>
+            <w:pPr>
+              <w:spacing w:before="0" w:after="0" w:line="240" w:lineRule="auto"/>
+              <w:jc w:val="center"/>
+            </w:pPr>
+            <w:r>
+              <w:rPr>
+                <w:sz w:val="15"/>
+              </w:rPr>
+              <w:t>1.0000</w:t>
+            </w:r>
+          </w:p>
+        </w:tc>
+      </w:tr>
+      <w:tr>
+        <w:tc>
+          <w:tcPr>
+            <w:tcW w:type="dxa" w:w="3000"/>
+            <w:vAlign w:val="center"/>
+          </w:tcPr>
+          <w:p>
+            <w:pPr>
+              <w:spacing w:before="0" w:after="0" w:line="240" w:lineRule="auto"/>
+            </w:pPr>
+            <w:r>
+              <w:rPr>
+                <w:sz w:val="15"/>
+              </w:rPr>
+              <w:t>Answer correctness</w:t>
+            </w:r>
+          </w:p>
+        </w:tc>
+        <w:tc>
+          <w:tcPr>
+            <w:tcW w:type="dxa" w:w="1500"/>
+            <w:vAlign w:val="center"/>
+          </w:tcPr>
+          <w:p>
+            <w:pPr>
+              <w:spacing w:before="0" w:after="0" w:line="240" w:lineRule="auto"/>
+              <w:jc w:val="center"/>
+            </w:pPr>
+            <w:r>
+              <w:rPr>
+                <w:sz w:val="15"/>
+              </w:rPr>
+              <w:t>0.9866</w:t>
+            </w:r>
+          </w:p>
+        </w:tc>
+        <w:tc>
+          <w:tcPr>
+            <w:tcW w:type="dxa" w:w="1500"/>
+            <w:vAlign w:val="center"/>
+          </w:tcPr>
+          <w:p>
+            <w:pPr>
+              <w:spacing w:before="0" w:after="0" w:line="240" w:lineRule="auto"/>
+              <w:jc w:val="center"/>
+            </w:pPr>
+            <w:r>
+              <w:rPr>
+                <w:sz w:val="15"/>
+              </w:rPr>
+              <w:t>0.9642</w:t>
+            </w:r>
+          </w:p>
+        </w:tc>
+        <w:tc>
+          <w:tcPr>
+            <w:tcW w:type="dxa" w:w="1500"/>
+            <w:vAlign w:val="center"/>
+          </w:tcPr>
+          <w:p>
+            <w:pPr>
+              <w:spacing w:before="0" w:after="0" w:line="240" w:lineRule="auto"/>
+              <w:jc w:val="center"/>
+            </w:pPr>
+            <w:r>
+              <w:rPr>
+                <w:sz w:val="15"/>
+              </w:rPr>
+              <w:t>0.8933</w:t>
+            </w:r>
+          </w:p>
+        </w:tc>
+        <w:tc>
+          <w:tcPr>
+            <w:tcW w:type="dxa" w:w="1860"/>
+            <w:vAlign w:val="center"/>
+          </w:tcPr>
+          <w:p>
+            <w:pPr>
+              <w:spacing w:before="0" w:after="0" w:line="240" w:lineRule="auto"/>
+              <w:jc w:val="center"/>
+            </w:pPr>
+            <w:r>
+              <w:rPr>
+                <w:sz w:val="15"/>
+              </w:rPr>
+              <w:t>0.9481</w:t>
+            </w:r>
+          </w:p>
+        </w:tc>
+      </w:tr>
+      <w:tr>
+        <w:tc>
+          <w:tcPr>
+            <w:tcW w:type="dxa" w:w="3000"/>
+            <w:vAlign w:val="center"/>
+          </w:tcPr>
+          <w:p>
+            <w:pPr>
+              <w:spacing w:before="0" w:after="0" w:line="240" w:lineRule="auto"/>
+            </w:pPr>
+            <w:r>
+              <w:rPr>
+                <w:sz w:val="15"/>
+              </w:rPr>
+              <w:t>Answer similarity</w:t>
+            </w:r>
+          </w:p>
+        </w:tc>
+        <w:tc>
+          <w:tcPr>
+            <w:tcW w:type="dxa" w:w="1500"/>
+            <w:vAlign w:val="center"/>
+          </w:tcPr>
+          <w:p>
+            <w:pPr>
+              <w:spacing w:before="0" w:after="0" w:line="240" w:lineRule="auto"/>
+              <w:jc w:val="center"/>
+            </w:pPr>
+            <w:r>
+              <w:rPr>
+                <w:sz w:val="15"/>
+              </w:rPr>
+              <w:t>0.9465</w:t>
+            </w:r>
+          </w:p>
+        </w:tc>
+        <w:tc>
+          <w:tcPr>
+            <w:tcW w:type="dxa" w:w="1500"/>
+            <w:vAlign w:val="center"/>
+          </w:tcPr>
+          <w:p>
+            <w:pPr>
+              <w:spacing w:before="0" w:after="0" w:line="240" w:lineRule="auto"/>
+              <w:jc w:val="center"/>
+            </w:pPr>
+            <w:r>
+              <w:rPr>
+                <w:sz w:val="15"/>
+              </w:rPr>
+              <w:t>0.8570</w:t>
+            </w:r>
+          </w:p>
+        </w:tc>
+        <w:tc>
+          <w:tcPr>
+            <w:tcW w:type="dxa" w:w="1500"/>
+            <w:vAlign w:val="center"/>
+          </w:tcPr>
+          <w:p>
+            <w:pPr>
+              <w:spacing w:before="0" w:after="0" w:line="240" w:lineRule="auto"/>
+              <w:jc w:val="center"/>
+            </w:pPr>
+            <w:r>
+              <w:rPr>
+                <w:sz w:val="15"/>
+              </w:rPr>
+              <w:t>0.8232</w:t>
+            </w:r>
+          </w:p>
+        </w:tc>
+        <w:tc>
+          <w:tcPr>
+            <w:tcW w:type="dxa" w:w="1860"/>
+            <w:vAlign w:val="center"/>
+          </w:tcPr>
+          <w:p>
+            <w:pPr>
+              <w:spacing w:before="0" w:after="0" w:line="240" w:lineRule="auto"/>
+              <w:jc w:val="center"/>
+            </w:pPr>
+            <w:r>
+              <w:rPr>
+                <w:sz w:val="15"/>
+              </w:rPr>
+              <w:t>0.8756</w:t>
+            </w:r>
+          </w:p>
+        </w:tc>
+      </w:tr>
+    </w:tbl>
+    <w:p>
+      <w:r>
+        <w:t>Observed behavior. Context precision and context recall were 1.0000 for all three questions, indicating strong reference-aligned retrieval in this sample. Q220 combined 0.9866 correctness with 0.5000 faithfulness, showing that reference agreement alone cannot replace claim-to-context verification. Q1016 was strong across all measures. Q1226 was fully grounded but less concise and reference-aligned, reflected in lower relevancy and similarity.</w:t>
+      </w:r>
+    </w:p>
+    <w:p>
+      <w:r>
+        <w:t>Scope and hardware observation. These three fully scored questions are a development sample, not a held-out production benchmark. Local qwen3:8b both generated and judged answers, so human review remains necessary to control self-judge bias. The sample was kept at three because sustained local inference caused significant MacBook heat; this is a machine resource constraint and not an observed algorithm failure.</w:t>
+      </w:r>
+    </w:p>
+    <w:p>
+      <w:pPr>
         <w:pStyle w:val="Heading1"/>
       </w:pPr>
       <w:r>

</xml_diff>